<commit_message>
Final targeted repair for 2026-09-02 to 2026-09-05
</commit_message>
<xml_diff>
--- a/daily/2026-09-02/word/GUIDE_20260902_05_EV_Charging_Standard_Compatibility.docx
+++ b/daily/2026-09-02/word/GUIDE_20260902_05_EV_Charging_Standard_Compatibility.docx
@@ -216,7 +216,7 @@
           </w:tcPr>
           <w:p>
             <w:r>
-              <w:t>Primary deployment</w:t>
+              <w:t>Primary use</w:t>
             </w:r>
           </w:p>
         </w:tc>
@@ -1298,7 +1298,7 @@
           </w:tcPr>
           <w:p>
             <w:r>
-              <w:t>CHAdeMO/CCS regional deployment, certification differences</w:t>
+              <w:t>CHAdeMO/CCS regional rollout, certification differences</w:t>
             </w:r>
           </w:p>
         </w:tc>
@@ -1646,7 +1646,7 @@
         <w:t>Reference market</w:t>
       </w:r>
       <w:r>
-        <w:t>: Global (China export side; EU/JP/NA deployment)</w:t>
+        <w:t>: Global (China export side; EU/JP/NA rollout)</w:t>
       </w:r>
     </w:p>
     <w:p>

</xml_diff>